<commit_message>
Aggiungo capitolo Quantum P2P con approfondimenti Cellcrypt e Signal
</commit_message>
<xml_diff>
--- a/files/secure_communications_overview.docx
+++ b/files/secure_communications_overview.docx
@@ -2096,6 +2096,2123 @@
         <w:t>Soluzioni USA (Signal, Wickr, Silent Circle): eccellenti tecnicamente ma esposte al CLOUD Act e alla giurisdizione USA — da valutare con attenzione in contesti europei sensibili.</w:t>
       </w:r>
     </w:p>
+    <w:p>
+      <w:r>
+        <w:br w:type="page"/>
+      </w:r>
+    </w:p>
+    <w:p>
+      <w:pPr>
+        <w:pStyle w:val="Heading1"/>
+      </w:pPr>
+      <w:r>
+        <w:t>Comunicazione P2P con Protezione Post-Quantistica</w:t>
+      </w:r>
+    </w:p>
+    <w:p>
+      <w:pPr/>
+      <w:r>
+        <w:rPr>
+          <w:b w:val="0"/>
+          <w:i w:val="0"/>
+        </w:rPr>
+        <w:t>Con la pubblicazione nel 2024 dei primi standard ufficiali NIST per la Post-Quantum Cryptography (PQC) — ML-KEM (Kyber), ML-DSA (Dilithium) e SLH-DSA — il settore delle comunicazioni sicure ha avviato una transizione strutturale verso algoritmi resistenti ai computer quantistici. La minaccia più concreta oggi non è ancora un computer quantistico pienamente funzionale, ma il paradigma "harvest now, decrypt later": attori malevoli intercettano traffico cifrato oggi con l'intento di decifrarlo in futuro, quando la potenza quantistica lo renderà possibile. Questo capitolo analizza le soluzioni disponibili per le chiamate peer-to-peer con protezione post-quantistica.</w:t>
+      </w:r>
+    </w:p>
+    <w:p>
+      <w:pPr>
+        <w:pStyle w:val="Heading2"/>
+      </w:pPr>
+      <w:r>
+        <w:t>1. Contesto: Perché la Protezione Quantistica è Urgente</w:t>
+      </w:r>
+    </w:p>
+    <w:p>
+      <w:pPr/>
+      <w:r>
+        <w:rPr>
+          <w:b w:val="0"/>
+          <w:i w:val="0"/>
+        </w:rPr>
+        <w:t>I protocolli crittografici classici (RSA, ECDH, AES-128) sono vulnerabili all'algoritmo di Shor, eseguibile da un computer quantistico sufficientemente potente. Per le comunicazioni vocali cifrate, le implicazioni sono critiche:</w:t>
+      </w:r>
+    </w:p>
+    <w:p>
+      <w:pPr>
+        <w:pStyle w:val="ListBullet"/>
+      </w:pPr>
+      <w:r>
+        <w:rPr>
+          <w:b/>
+        </w:rPr>
+        <w:t xml:space="preserve">Intercettazione retroattiva: </w:t>
+      </w:r>
+      <w:r>
+        <w:t>conversazioni registrate oggi possono essere decifrate in futuro.</w:t>
+      </w:r>
+    </w:p>
+    <w:p>
+      <w:pPr>
+        <w:pStyle w:val="ListBullet"/>
+      </w:pPr>
+      <w:r>
+        <w:rPr>
+          <w:b/>
+        </w:rPr>
+        <w:t xml:space="preserve">Autenticazione compromessa: </w:t>
+      </w:r>
+      <w:r>
+        <w:t>le firme digitali basate su ECC o RSA perdono validità.</w:t>
+      </w:r>
+    </w:p>
+    <w:p>
+      <w:pPr>
+        <w:pStyle w:val="ListBullet"/>
+      </w:pPr>
+      <w:r>
+        <w:rPr>
+          <w:b/>
+        </w:rPr>
+        <w:t xml:space="preserve">Perfect Forward Secrecy classica non basta: </w:t>
+      </w:r>
+      <w:r>
+        <w:t>i meccanismi di derivazione delle chiavi (ECDH) sono vulnerabili.</w:t>
+      </w:r>
+    </w:p>
+    <w:p>
+      <w:pPr>
+        <w:pStyle w:val="ListBullet"/>
+      </w:pPr>
+      <w:r>
+        <w:rPr>
+          <w:b/>
+        </w:rPr>
+        <w:t xml:space="preserve">Infrastrutture critiche a rischio: </w:t>
+      </w:r>
+      <w:r>
+        <w:t>difesa, finanza, sanità richiedono garanzie di lungo periodo.</w:t>
+      </w:r>
+    </w:p>
+    <w:p>
+      <w:pPr>
+        <w:pStyle w:val="Heading2"/>
+      </w:pPr>
+      <w:r>
+        <w:t>2. Panoramica delle Soluzioni di Mercato</w:t>
+      </w:r>
+    </w:p>
+    <w:p>
+      <w:pPr/>
+      <w:r>
+        <w:rPr>
+          <w:b w:val="0"/>
+          <w:i w:val="0"/>
+        </w:rPr>
+        <w:t>Il mercato offre oggi tre categorie di soluzioni per la protezione post-quantistica delle chiamate P2P:</w:t>
+      </w:r>
+    </w:p>
+    <w:p>
+      <w:pPr>
+        <w:pStyle w:val="ListBullet"/>
+      </w:pPr>
+      <w:r>
+        <w:rPr>
+          <w:b/>
+        </w:rPr>
+        <w:t xml:space="preserve">Soluzioni specializzate (military/gov): </w:t>
+      </w:r>
+      <w:r>
+        <w:t>Cellcrypt, Silentel, ASELSAN — progettate nativamente con PQC.</w:t>
+      </w:r>
+    </w:p>
+    <w:p>
+      <w:pPr>
+        <w:pStyle w:val="ListBullet"/>
+      </w:pPr>
+      <w:r>
+        <w:rPr>
+          <w:b/>
+        </w:rPr>
+        <w:t xml:space="preserve">Piattaforme enterprise in transizione: </w:t>
+      </w:r>
+      <w:r>
+        <w:t>AWS Wickr, Microsoft Teams, Cisco Webex — PQC in roadmap o parzialmente implementata.</w:t>
+      </w:r>
+    </w:p>
+    <w:p>
+      <w:pPr>
+        <w:pStyle w:val="ListBullet"/>
+      </w:pPr>
+      <w:r>
+        <w:rPr>
+          <w:b/>
+        </w:rPr>
+        <w:t xml:space="preserve">App consumer con PQC: </w:t>
+      </w:r>
+      <w:r>
+        <w:t>Signal (SPQR), Threema — ricerca attiva con IBM per integrare algoritmi NIST.</w:t>
+      </w:r>
+    </w:p>
+    <w:p/>
+    <w:p>
+      <w:pPr/>
+      <w:r>
+        <w:rPr>
+          <w:b/>
+          <w:i w:val="0"/>
+        </w:rPr>
+        <w:t>Tabella comparativa — Soluzioni P2P con protezione PQC:</w:t>
+      </w:r>
+    </w:p>
+    <w:tbl>
+      <w:tblPr>
+        <w:tblStyle w:val="TableGrid"/>
+        <w:tblW w:type="auto" w:w="0"/>
+        <w:tblLook w:firstColumn="1" w:firstRow="1" w:lastColumn="0" w:lastRow="0" w:noHBand="0" w:noVBand="1" w:val="04A0"/>
+      </w:tblPr>
+      <w:tblGrid>
+        <w:gridCol w:w="1881"/>
+        <w:gridCol w:w="1881"/>
+        <w:gridCol w:w="1881"/>
+        <w:gridCol w:w="1881"/>
+        <w:gridCol w:w="1881"/>
+      </w:tblGrid>
+      <w:tr>
+        <w:tc>
+          <w:tcPr>
+            <w:tcW w:type="dxa" w:w="1881"/>
+          </w:tcPr>
+          <w:p>
+            <w:r>
+              <w:rPr>
+                <w:b/>
+                <w:sz w:val="17"/>
+              </w:rPr>
+              <w:t>Azienda/Prodotto</w:t>
+            </w:r>
+          </w:p>
+        </w:tc>
+        <w:tc>
+          <w:tcPr>
+            <w:tcW w:type="dxa" w:w="1881"/>
+          </w:tcPr>
+          <w:p>
+            <w:r>
+              <w:rPr>
+                <w:b/>
+                <w:sz w:val="17"/>
+              </w:rPr>
+              <w:t>Livello PQC</w:t>
+            </w:r>
+          </w:p>
+        </w:tc>
+        <w:tc>
+          <w:tcPr>
+            <w:tcW w:type="dxa" w:w="1881"/>
+          </w:tcPr>
+          <w:p>
+            <w:r>
+              <w:rPr>
+                <w:b/>
+                <w:sz w:val="17"/>
+              </w:rPr>
+              <w:t>Algoritmi</w:t>
+            </w:r>
+          </w:p>
+        </w:tc>
+        <w:tc>
+          <w:tcPr>
+            <w:tcW w:type="dxa" w:w="1881"/>
+          </w:tcPr>
+          <w:p>
+            <w:r>
+              <w:rPr>
+                <w:b/>
+                <w:sz w:val="17"/>
+              </w:rPr>
+              <w:t>Target</w:t>
+            </w:r>
+          </w:p>
+        </w:tc>
+        <w:tc>
+          <w:tcPr>
+            <w:tcW w:type="dxa" w:w="1881"/>
+          </w:tcPr>
+          <w:p>
+            <w:r>
+              <w:rPr>
+                <w:b/>
+                <w:sz w:val="17"/>
+              </w:rPr>
+              <w:t>Stato</w:t>
+            </w:r>
+          </w:p>
+        </w:tc>
+      </w:tr>
+      <w:tr>
+        <w:tc>
+          <w:tcPr>
+            <w:tcW w:type="dxa" w:w="1881"/>
+          </w:tcPr>
+          <w:p>
+            <w:r>
+              <w:rPr>
+                <w:sz w:val="17"/>
+              </w:rPr>
+              <w:t>Cellcrypt (UK)</w:t>
+            </w:r>
+          </w:p>
+        </w:tc>
+        <w:tc>
+          <w:tcPr>
+            <w:tcW w:type="dxa" w:w="1881"/>
+          </w:tcPr>
+          <w:p>
+            <w:r>
+              <w:rPr>
+                <w:sz w:val="17"/>
+              </w:rPr>
+              <w:t>⭐⭐⭐⭐⭐</w:t>
+            </w:r>
+          </w:p>
+        </w:tc>
+        <w:tc>
+          <w:tcPr>
+            <w:tcW w:type="dxa" w:w="1881"/>
+          </w:tcPr>
+          <w:p>
+            <w:r>
+              <w:rPr>
+                <w:sz w:val="17"/>
+              </w:rPr>
+              <w:t>CRYSTALS-Kyber + Classic McEliece (dual-layer)</w:t>
+            </w:r>
+          </w:p>
+        </w:tc>
+        <w:tc>
+          <w:tcPr>
+            <w:tcW w:type="dxa" w:w="1881"/>
+          </w:tcPr>
+          <w:p>
+            <w:r>
+              <w:rPr>
+                <w:sz w:val="17"/>
+              </w:rPr>
+              <w:t>Governi, difesa, enterprise</w:t>
+            </w:r>
+          </w:p>
+        </w:tc>
+        <w:tc>
+          <w:tcPr>
+            <w:tcW w:type="dxa" w:w="1881"/>
+          </w:tcPr>
+          <w:p>
+            <w:r>
+              <w:rPr>
+                <w:sz w:val="17"/>
+              </w:rPr>
+              <w:t>In produzione</w:t>
+            </w:r>
+          </w:p>
+        </w:tc>
+      </w:tr>
+      <w:tr>
+        <w:tc>
+          <w:tcPr>
+            <w:tcW w:type="dxa" w:w="1881"/>
+          </w:tcPr>
+          <w:p>
+            <w:r>
+              <w:rPr>
+                <w:sz w:val="17"/>
+              </w:rPr>
+              <w:t>Signal (SPQR)</w:t>
+            </w:r>
+          </w:p>
+        </w:tc>
+        <w:tc>
+          <w:tcPr>
+            <w:tcW w:type="dxa" w:w="1881"/>
+          </w:tcPr>
+          <w:p>
+            <w:r>
+              <w:rPr>
+                <w:sz w:val="17"/>
+              </w:rPr>
+              <w:t>⭐⭐⭐⭐</w:t>
+            </w:r>
+          </w:p>
+        </w:tc>
+        <w:tc>
+          <w:tcPr>
+            <w:tcW w:type="dxa" w:w="1881"/>
+          </w:tcPr>
+          <w:p>
+            <w:r>
+              <w:rPr>
+                <w:sz w:val="17"/>
+              </w:rPr>
+              <w:t>PQXDH (Kyber-1024) + X3DH classico</w:t>
+            </w:r>
+          </w:p>
+        </w:tc>
+        <w:tc>
+          <w:tcPr>
+            <w:tcW w:type="dxa" w:w="1881"/>
+          </w:tcPr>
+          <w:p>
+            <w:r>
+              <w:rPr>
+                <w:sz w:val="17"/>
+              </w:rPr>
+              <w:t>Consumer + enterprise</w:t>
+            </w:r>
+          </w:p>
+        </w:tc>
+        <w:tc>
+          <w:tcPr>
+            <w:tcW w:type="dxa" w:w="1881"/>
+          </w:tcPr>
+          <w:p>
+            <w:r>
+              <w:rPr>
+                <w:sz w:val="17"/>
+              </w:rPr>
+              <w:t>In produzione</w:t>
+            </w:r>
+          </w:p>
+        </w:tc>
+      </w:tr>
+      <w:tr>
+        <w:tc>
+          <w:tcPr>
+            <w:tcW w:type="dxa" w:w="1881"/>
+          </w:tcPr>
+          <w:p>
+            <w:r>
+              <w:rPr>
+                <w:sz w:val="17"/>
+              </w:rPr>
+              <w:t>AWS Wickr</w:t>
+            </w:r>
+          </w:p>
+        </w:tc>
+        <w:tc>
+          <w:tcPr>
+            <w:tcW w:type="dxa" w:w="1881"/>
+          </w:tcPr>
+          <w:p>
+            <w:r>
+              <w:rPr>
+                <w:sz w:val="17"/>
+              </w:rPr>
+              <w:t>⭐⭐⭐⭐</w:t>
+            </w:r>
+          </w:p>
+        </w:tc>
+        <w:tc>
+          <w:tcPr>
+            <w:tcW w:type="dxa" w:w="1881"/>
+          </w:tcPr>
+          <w:p>
+            <w:r>
+              <w:rPr>
+                <w:sz w:val="17"/>
+              </w:rPr>
+              <w:t>E2EE militare + PQC in integrazione</w:t>
+            </w:r>
+          </w:p>
+        </w:tc>
+        <w:tc>
+          <w:tcPr>
+            <w:tcW w:type="dxa" w:w="1881"/>
+          </w:tcPr>
+          <w:p>
+            <w:r>
+              <w:rPr>
+                <w:sz w:val="17"/>
+              </w:rPr>
+              <w:t>Enterprise, PA, governi</w:t>
+            </w:r>
+          </w:p>
+        </w:tc>
+        <w:tc>
+          <w:tcPr>
+            <w:tcW w:type="dxa" w:w="1881"/>
+          </w:tcPr>
+          <w:p>
+            <w:r>
+              <w:rPr>
+                <w:sz w:val="17"/>
+              </w:rPr>
+              <w:t>In transizione</w:t>
+            </w:r>
+          </w:p>
+        </w:tc>
+      </w:tr>
+      <w:tr>
+        <w:tc>
+          <w:tcPr>
+            <w:tcW w:type="dxa" w:w="1881"/>
+          </w:tcPr>
+          <w:p>
+            <w:r>
+              <w:rPr>
+                <w:sz w:val="17"/>
+              </w:rPr>
+              <w:t>Threema Work</w:t>
+            </w:r>
+          </w:p>
+        </w:tc>
+        <w:tc>
+          <w:tcPr>
+            <w:tcW w:type="dxa" w:w="1881"/>
+          </w:tcPr>
+          <w:p>
+            <w:r>
+              <w:rPr>
+                <w:sz w:val="17"/>
+              </w:rPr>
+              <w:t>⭐⭐⭐⭐</w:t>
+            </w:r>
+          </w:p>
+        </w:tc>
+        <w:tc>
+          <w:tcPr>
+            <w:tcW w:type="dxa" w:w="1881"/>
+          </w:tcPr>
+          <w:p>
+            <w:r>
+              <w:rPr>
+                <w:sz w:val="17"/>
+              </w:rPr>
+              <w:t>PQC in sviluppo (IBM collaboration)</w:t>
+            </w:r>
+          </w:p>
+        </w:tc>
+        <w:tc>
+          <w:tcPr>
+            <w:tcW w:type="dxa" w:w="1881"/>
+          </w:tcPr>
+          <w:p>
+            <w:r>
+              <w:rPr>
+                <w:sz w:val="17"/>
+              </w:rPr>
+              <w:t>Enterprise europeo</w:t>
+            </w:r>
+          </w:p>
+        </w:tc>
+        <w:tc>
+          <w:tcPr>
+            <w:tcW w:type="dxa" w:w="1881"/>
+          </w:tcPr>
+          <w:p>
+            <w:r>
+              <w:rPr>
+                <w:sz w:val="17"/>
+              </w:rPr>
+              <w:t>In sviluppo</w:t>
+            </w:r>
+          </w:p>
+        </w:tc>
+      </w:tr>
+      <w:tr>
+        <w:tc>
+          <w:tcPr>
+            <w:tcW w:type="dxa" w:w="1881"/>
+          </w:tcPr>
+          <w:p>
+            <w:r>
+              <w:rPr>
+                <w:sz w:val="17"/>
+              </w:rPr>
+              <w:t>Thales + Quantinuum</w:t>
+            </w:r>
+          </w:p>
+        </w:tc>
+        <w:tc>
+          <w:tcPr>
+            <w:tcW w:type="dxa" w:w="1881"/>
+          </w:tcPr>
+          <w:p>
+            <w:r>
+              <w:rPr>
+                <w:sz w:val="17"/>
+              </w:rPr>
+              <w:t>⭐⭐⭐⭐</w:t>
+            </w:r>
+          </w:p>
+        </w:tc>
+        <w:tc>
+          <w:tcPr>
+            <w:tcW w:type="dxa" w:w="1881"/>
+          </w:tcPr>
+          <w:p>
+            <w:r>
+              <w:rPr>
+                <w:sz w:val="17"/>
+              </w:rPr>
+              <w:t>QRNG + algoritmi NIST PQC</w:t>
+            </w:r>
+          </w:p>
+        </w:tc>
+        <w:tc>
+          <w:tcPr>
+            <w:tcW w:type="dxa" w:w="1881"/>
+          </w:tcPr>
+          <w:p>
+            <w:r>
+              <w:rPr>
+                <w:sz w:val="17"/>
+              </w:rPr>
+              <w:t>Banche, infrastrutture</w:t>
+            </w:r>
+          </w:p>
+        </w:tc>
+        <w:tc>
+          <w:tcPr>
+            <w:tcW w:type="dxa" w:w="1881"/>
+          </w:tcPr>
+          <w:p>
+            <w:r>
+              <w:rPr>
+                <w:sz w:val="17"/>
+              </w:rPr>
+              <w:t>In produzione (PKI/HSM)</w:t>
+            </w:r>
+          </w:p>
+        </w:tc>
+      </w:tr>
+      <w:tr>
+        <w:tc>
+          <w:tcPr>
+            <w:tcW w:type="dxa" w:w="1881"/>
+          </w:tcPr>
+          <w:p>
+            <w:r>
+              <w:rPr>
+                <w:sz w:val="17"/>
+              </w:rPr>
+              <w:t>Microsoft Teams</w:t>
+            </w:r>
+          </w:p>
+        </w:tc>
+        <w:tc>
+          <w:tcPr>
+            <w:tcW w:type="dxa" w:w="1881"/>
+          </w:tcPr>
+          <w:p>
+            <w:r>
+              <w:rPr>
+                <w:sz w:val="17"/>
+              </w:rPr>
+              <w:t>⭐⭐⭐</w:t>
+            </w:r>
+          </w:p>
+        </w:tc>
+        <w:tc>
+          <w:tcPr>
+            <w:tcW w:type="dxa" w:w="1881"/>
+          </w:tcPr>
+          <w:p>
+            <w:r>
+              <w:rPr>
+                <w:sz w:val="17"/>
+              </w:rPr>
+              <w:t>Roadmap NIST PQC 2025-2026</w:t>
+            </w:r>
+          </w:p>
+        </w:tc>
+        <w:tc>
+          <w:tcPr>
+            <w:tcW w:type="dxa" w:w="1881"/>
+          </w:tcPr>
+          <w:p>
+            <w:r>
+              <w:rPr>
+                <w:sz w:val="17"/>
+              </w:rPr>
+              <w:t>Enterprise globale</w:t>
+            </w:r>
+          </w:p>
+        </w:tc>
+        <w:tc>
+          <w:tcPr>
+            <w:tcW w:type="dxa" w:w="1881"/>
+          </w:tcPr>
+          <w:p>
+            <w:r>
+              <w:rPr>
+                <w:sz w:val="17"/>
+              </w:rPr>
+              <w:t>Roadmap</w:t>
+            </w:r>
+          </w:p>
+        </w:tc>
+      </w:tr>
+    </w:tbl>
+    <w:p/>
+    <w:p>
+      <w:pPr>
+        <w:pStyle w:val="Heading2"/>
+      </w:pPr>
+      <w:r>
+        <w:t>3. Approfondimento: Cellcrypt</w:t>
+      </w:r>
+    </w:p>
+    <w:p>
+      <w:pPr/>
+      <w:r>
+        <w:rPr>
+          <w:b/>
+          <w:i w:val="0"/>
+        </w:rPr>
+        <w:t>Produttore: Cellcrypt Ltd (Regno Unito)</w:t>
+      </w:r>
+    </w:p>
+    <w:p>
+      <w:pPr/>
+      <w:r>
+        <w:rPr>
+          <w:b w:val="0"/>
+          <w:i w:val="0"/>
+        </w:rPr>
+        <w:t>Sito: www.cellcrypt.com</w:t>
+      </w:r>
+    </w:p>
+    <w:p>
+      <w:pPr/>
+      <w:r>
+        <w:rPr>
+          <w:b w:val="0"/>
+          <w:i w:val="0"/>
+        </w:rPr>
+      </w:r>
+    </w:p>
+    <w:p>
+      <w:pPr>
+        <w:pStyle w:val="Heading3"/>
+      </w:pPr>
+      <w:r>
+        <w:t>Panoramica</w:t>
+      </w:r>
+    </w:p>
+    <w:p>
+      <w:pPr/>
+      <w:r>
+        <w:rPr>
+          <w:b w:val="0"/>
+          <w:i w:val="0"/>
+        </w:rPr>
+        <w:t>Cellcrypt è la soluzione più avanzata disponibile commercialmente per le chiamate vocali cifrate con doppia protezione post-quantistica. Progettata originariamente per uso militare e governativo, è oggi disponibile anche per enterprise regolamentate (finanza, sanità, energia). È l'unica soluzione commerciale che implementa simultaneamente due famiglie indipendenti di algoritmi PQC, garantendo protezione anche nel caso in cui uno dei due venisse compromesso.</w:t>
+      </w:r>
+    </w:p>
+    <w:p>
+      <w:pPr>
+        <w:pStyle w:val="Heading3"/>
+      </w:pPr>
+      <w:r>
+        <w:t>Architettura di Cifratura PQC</w:t>
+      </w:r>
+    </w:p>
+    <w:p>
+      <w:pPr/>
+      <w:r>
+        <w:rPr>
+          <w:b w:val="0"/>
+          <w:i w:val="0"/>
+        </w:rPr>
+        <w:t>Il punto di forza di Cellcrypt è il suo approccio "dual-layer" alla crittografia post-quantistica:</w:t>
+      </w:r>
+    </w:p>
+    <w:p>
+      <w:pPr>
+        <w:pStyle w:val="ListBullet"/>
+      </w:pPr>
+      <w:r>
+        <w:rPr>
+          <w:b/>
+        </w:rPr>
+        <w:t xml:space="preserve">Livello 1 — CRYSTALS-Kyber (ML-KEM): </w:t>
+      </w:r>
+      <w:r>
+        <w:t>Algoritmo di Key Encapsulation Mechanism (KEM) standardizzato dal NIST come ML-KEM. Basato su reticoli strutturati (Module Learning With Errors), offre performance eccellenti e dimensioni di chiave contenute. Kyber-1024 fornisce sicurezza equivalente ad AES-256.</w:t>
+      </w:r>
+    </w:p>
+    <w:p>
+      <w:pPr>
+        <w:pStyle w:val="ListBullet"/>
+      </w:pPr>
+      <w:r>
+        <w:rPr>
+          <w:b/>
+        </w:rPr>
+        <w:t xml:space="preserve">Livello 2 — Classic McEliece: </w:t>
+      </w:r>
+      <w:r>
+        <w:t>Algoritmo basato su teoria dei codici correttori (Goppa codes), proposto come alternativa al primo livello. La sua robustezza è studiata da oltre 45 anni senza attacchi noti. Ha chiavi pubbliche grandi (~1 MB) ma offre una diversificazione crittografica fondamentale: se Kyber venisse violato, McEliece rimane intatto.</w:t>
+      </w:r>
+    </w:p>
+    <w:p>
+      <w:pPr>
+        <w:pStyle w:val="ListBullet"/>
+      </w:pPr>
+      <w:r>
+        <w:rPr>
+          <w:b/>
+        </w:rPr>
+        <w:t xml:space="preserve">Strato classico E2EE: </w:t>
+      </w:r>
+      <w:r>
+        <w:t>Su entrambi i livelli PQC si aggiunge la cifratura end-to-end classica (AES-256-GCM) per la protezione del contenuto della chiamata. L'approccio "hybrid" garantisce che, anche se l'intera PQC risultasse vulnerabile, la cifratura simmetrica classica rimanga attiva.</w:t>
+      </w:r>
+    </w:p>
+    <w:p>
+      <w:pPr>
+        <w:pStyle w:val="Heading3"/>
+      </w:pPr>
+      <w:r>
+        <w:t>Caratteristiche Tecniche</w:t>
+      </w:r>
+    </w:p>
+    <w:p>
+      <w:pPr>
+        <w:pStyle w:val="ListBullet"/>
+      </w:pPr>
+      <w:r>
+        <w:rPr>
+          <w:b/>
+        </w:rPr>
+        <w:t xml:space="preserve">Cifratura voce: </w:t>
+      </w:r>
+      <w:r>
+        <w:t>E2EE con AES-256-GCM + dual-layer PQC per lo scambio chiavi</w:t>
+      </w:r>
+    </w:p>
+    <w:p>
+      <w:pPr>
+        <w:pStyle w:val="ListBullet"/>
+      </w:pPr>
+      <w:r>
+        <w:rPr>
+          <w:b/>
+        </w:rPr>
+        <w:t xml:space="preserve">Messaggistica: </w:t>
+      </w:r>
+      <w:r>
+        <w:t>Testi, file e allegati con la medesima protezione delle chiamate</w:t>
+      </w:r>
+    </w:p>
+    <w:p>
+      <w:pPr>
+        <w:pStyle w:val="ListBullet"/>
+      </w:pPr>
+      <w:r>
+        <w:rPr>
+          <w:b/>
+        </w:rPr>
+        <w:t xml:space="preserve">Architettura: </w:t>
+      </w:r>
+      <w:r>
+        <w:t>Zero-trust; nessun dato in chiaro attraversa i server di Cellcrypt</w:t>
+      </w:r>
+    </w:p>
+    <w:p>
+      <w:pPr>
+        <w:pStyle w:val="ListBullet"/>
+      </w:pPr>
+      <w:r>
+        <w:rPr>
+          <w:b/>
+        </w:rPr>
+        <w:t xml:space="preserve">Deployment: </w:t>
+      </w:r>
+      <w:r>
+        <w:t>SaaS, on-premises o hybrid; server gestibile in cloud privato del cliente</w:t>
+      </w:r>
+    </w:p>
+    <w:p>
+      <w:pPr>
+        <w:pStyle w:val="ListBullet"/>
+      </w:pPr>
+      <w:r>
+        <w:rPr>
+          <w:b/>
+        </w:rPr>
+        <w:t xml:space="preserve">Platform: </w:t>
+      </w:r>
+      <w:r>
+        <w:t>iOS, Android, Windows, macOS</w:t>
+      </w:r>
+    </w:p>
+    <w:p>
+      <w:pPr>
+        <w:pStyle w:val="ListBullet"/>
+      </w:pPr>
+      <w:r>
+        <w:rPr>
+          <w:b/>
+        </w:rPr>
+        <w:t xml:space="preserve">Autenticazione: </w:t>
+      </w:r>
+      <w:r>
+        <w:t>Certificati digitali + MFA; supporto PKI aziendale</w:t>
+      </w:r>
+    </w:p>
+    <w:p>
+      <w:pPr>
+        <w:pStyle w:val="ListBullet"/>
+      </w:pPr>
+      <w:r>
+        <w:rPr>
+          <w:b/>
+        </w:rPr>
+        <w:t xml:space="preserve">Out-of-band: </w:t>
+      </w:r>
+      <w:r>
+        <w:t>Canale secondario sicuro per comunicazioni di emergenza (crisis management)</w:t>
+      </w:r>
+    </w:p>
+    <w:p>
+      <w:pPr>
+        <w:pStyle w:val="ListBullet"/>
+      </w:pPr>
+      <w:r>
+        <w:rPr>
+          <w:b/>
+        </w:rPr>
+        <w:t xml:space="preserve">Certificazioni: </w:t>
+      </w:r>
+      <w:r>
+        <w:t>FIPS 140-2, Common Criteria; valutazione NATO NIAPC in corso</w:t>
+      </w:r>
+    </w:p>
+    <w:p>
+      <w:pPr>
+        <w:pStyle w:val="Heading3"/>
+      </w:pPr>
+      <w:r>
+        <w:t>Casi d'uso e Target</w:t>
+      </w:r>
+    </w:p>
+    <w:p>
+      <w:pPr>
+        <w:pStyle w:val="ListBullet"/>
+      </w:pPr>
+      <w:r>
+        <w:t>Difesa e forze armate (uso principale storico)</w:t>
+      </w:r>
+    </w:p>
+    <w:p>
+      <w:pPr>
+        <w:pStyle w:val="ListBullet"/>
+      </w:pPr>
+      <w:r>
+        <w:t>Agenzie di intelligence e sicurezza nazionale</w:t>
+      </w:r>
+    </w:p>
+    <w:p>
+      <w:pPr>
+        <w:pStyle w:val="ListBullet"/>
+      </w:pPr>
+      <w:r>
+        <w:t>Governo e ministeri in paesi NATO</w:t>
+      </w:r>
+    </w:p>
+    <w:p>
+      <w:pPr>
+        <w:pStyle w:val="ListBullet"/>
+      </w:pPr>
+      <w:r>
+        <w:t>Infrastrutture critiche (energia, telco, finanza)</w:t>
+      </w:r>
+    </w:p>
+    <w:p>
+      <w:pPr>
+        <w:pStyle w:val="ListBullet"/>
+      </w:pPr>
+      <w:r>
+        <w:t>Enterprise regolamentate con requisiti di compliance (GDPR, NIS2, DORA)</w:t>
+      </w:r>
+    </w:p>
+    <w:p>
+      <w:pPr>
+        <w:pStyle w:val="Heading3"/>
+      </w:pPr>
+      <w:r>
+        <w:t>Differenziatori chiave</w:t>
+      </w:r>
+    </w:p>
+    <w:p>
+      <w:pPr/>
+      <w:r>
+        <w:rPr>
+          <w:b w:val="0"/>
+          <w:i w:val="0"/>
+        </w:rPr>
+        <w:t>Il vantaggio principale di Cellcrypt rispetto ai competitor è la "crypto agility": il sistema è progettato per aggiornare gli algoritmi crittografici senza interruzione del servizio, anticipando la necessità di migrare a futuri standard NIST se algoritmi attuali venissero considerati vulnerabili. L'approccio dual-algorithm è un'assicurazione unica nel settore.</w:t>
+      </w:r>
+    </w:p>
+    <w:p>
+      <w:pPr>
+        <w:pStyle w:val="Heading2"/>
+      </w:pPr>
+      <w:r>
+        <w:t>4. Approfondimento: Signal con PQXDH e SPQR</w:t>
+      </w:r>
+    </w:p>
+    <w:p>
+      <w:pPr/>
+      <w:r>
+        <w:rPr>
+          <w:b/>
+          <w:i w:val="0"/>
+        </w:rPr>
+        <w:t>Produttore: Signal Foundation (USA, no-profit)</w:t>
+      </w:r>
+    </w:p>
+    <w:p>
+      <w:pPr/>
+      <w:r>
+        <w:rPr>
+          <w:b w:val="0"/>
+          <w:i w:val="0"/>
+        </w:rPr>
+        <w:t>Sito: www.signal.org</w:t>
+      </w:r>
+    </w:p>
+    <w:p>
+      <w:pPr/>
+      <w:r>
+        <w:rPr>
+          <w:b w:val="0"/>
+          <w:i w:val="0"/>
+        </w:rPr>
+      </w:r>
+    </w:p>
+    <w:p>
+      <w:pPr>
+        <w:pStyle w:val="Heading3"/>
+      </w:pPr>
+      <w:r>
+        <w:t>Panoramica</w:t>
+      </w:r>
+    </w:p>
+    <w:p>
+      <w:pPr/>
+      <w:r>
+        <w:rPr>
+          <w:b w:val="0"/>
+          <w:i w:val="0"/>
+        </w:rPr>
+        <w:t>Signal è la piattaforma di messaggistica e chiamate cifrate più nota al mondo, usata da giornalisti, attivisti, professionisti e organizzazioni enterprise. Il Signal Protocol, su cui si basa, è considerato lo standard de facto per le comunicazioni cifrate E2EE ed è adottato da WhatsApp, Google Messages, Facebook Messenger e molti altri. Dal 2023-2024 Signal ha avviato una transizione verso la protezione post-quantistica, integrando due nuovi meccanismi: PQXDH per l'inizializzazione delle sessioni e SPQR per la protezione continua delle conversazioni in corso.</w:t>
+      </w:r>
+    </w:p>
+    <w:p>
+      <w:pPr>
+        <w:pStyle w:val="Heading3"/>
+      </w:pPr>
+      <w:r>
+        <w:t>PQXDH — Post-Quantum Extended Diffie-Hellman</w:t>
+      </w:r>
+    </w:p>
+    <w:p>
+      <w:pPr/>
+      <w:r>
+        <w:rPr>
+          <w:b w:val="0"/>
+          <w:i w:val="0"/>
+        </w:rPr>
+        <w:t>PQXDH è il meccanismo che sostituisce il classico X3DH (Extended Triple Diffie-Hellman) utilizzato da Signal per stabilire una nuova sessione cifrata tra due utenti. Il problema con X3DH classico è che si basa su ECDH (Elliptic Curve Diffie-Hellman), vulnerabile all'algoritmo di Shor su computer quantistici.</w:t>
+      </w:r>
+    </w:p>
+    <w:p>
+      <w:pPr/>
+      <w:r>
+        <w:rPr>
+          <w:b w:val="0"/>
+          <w:i w:val="0"/>
+        </w:rPr>
+        <w:t>Come funziona PQXDH:</w:t>
+      </w:r>
+    </w:p>
+    <w:p>
+      <w:pPr>
+        <w:pStyle w:val="ListBullet"/>
+      </w:pPr>
+      <w:r>
+        <w:rPr>
+          <w:b/>
+        </w:rPr>
+        <w:t xml:space="preserve">Hybrid key agreement: </w:t>
+      </w:r>
+      <w:r>
+        <w:t>combina ECDH classico (X25519) con CRYSTALS-Kyber (Kyber-1024). Il segreto condiviso finale è derivato da entrambi, garantendo sicurezza "OR" — basta che uno dei due rimanga sicuro.</w:t>
+      </w:r>
+    </w:p>
+    <w:p>
+      <w:pPr>
+        <w:pStyle w:val="ListBullet"/>
+      </w:pPr>
+      <w:r>
+        <w:rPr>
+          <w:b/>
+        </w:rPr>
+        <w:t xml:space="preserve">Kyber-1024: </w:t>
+      </w:r>
+      <w:r>
+        <w:t>variante di massima sicurezza di CRYSTALS-Kyber (equivalente AES-256). Selezionato dal NIST come ML-KEM, standard ufficiale.</w:t>
+      </w:r>
+    </w:p>
+    <w:p>
+      <w:pPr>
+        <w:pStyle w:val="ListBullet"/>
+      </w:pPr>
+      <w:r>
+        <w:rPr>
+          <w:b/>
+        </w:rPr>
+        <w:t xml:space="preserve">Compatibilità backward: </w:t>
+      </w:r>
+      <w:r>
+        <w:t>il layer X25519 classico mantiene la sicurezza attuale; Kyber aggiunge protezione futura senza degradare le performance.</w:t>
+      </w:r>
+    </w:p>
+    <w:p>
+      <w:pPr>
+        <w:pStyle w:val="ListBullet"/>
+      </w:pPr>
+      <w:r>
+        <w:rPr>
+          <w:b/>
+        </w:rPr>
+        <w:t xml:space="preserve">Protezione "harvest now, decrypt later": </w:t>
+      </w:r>
+      <w:r>
+        <w:t>le sessioni stabilite con PQXDH non possono essere decifrate retroattivamente anche con computer quantistici futuri.</w:t>
+      </w:r>
+    </w:p>
+    <w:p>
+      <w:pPr>
+        <w:pStyle w:val="Heading3"/>
+      </w:pPr>
+      <w:r>
+        <w:t>SPQR — Sparse Post-Quantum Ratchet</w:t>
+      </w:r>
+    </w:p>
+    <w:p>
+      <w:pPr/>
+      <w:r>
+        <w:rPr>
+          <w:b w:val="0"/>
+          <w:i w:val="0"/>
+        </w:rPr>
+        <w:t>SPQR (introdotto nel 2025, in collaborazione con ricercatori IBM) affronta un problema diverso: non solo la fase iniziale della sessione, ma la protezione continua di ogni singolo messaggio e chiamata all'interno di una conversazione in corso.</w:t>
+      </w:r>
+    </w:p>
+    <w:p>
+      <w:pPr/>
+      <w:r>
+        <w:rPr>
+          <w:b w:val="0"/>
+          <w:i w:val="0"/>
+        </w:rPr>
+        <w:t>Il Signal Protocol usa un meccanismo chiamato "Double Ratchet" per derivare continuamente nuove chiavi crittografiche ad ogni messaggio (Perfect Forward Secrecy + Break-in Recovery). SPQR estende questo meccanismo con un ratchet post-quantistico:</w:t>
+      </w:r>
+    </w:p>
+    <w:p>
+      <w:pPr>
+        <w:pStyle w:val="ListBullet"/>
+      </w:pPr>
+      <w:r>
+        <w:rPr>
+          <w:b/>
+        </w:rPr>
+        <w:t xml:space="preserve">Ratchet quantistico "sparso": </w:t>
+      </w:r>
+      <w:r>
+        <w:t>non aggiorna la chiave PQC ad ogni messaggio (troppo costoso), ma ad intervalli strategici, mantenendo un equilibrio tra sicurezza e performance.</w:t>
+      </w:r>
+    </w:p>
+    <w:p>
+      <w:pPr>
+        <w:pStyle w:val="ListBullet"/>
+      </w:pPr>
+      <w:r>
+        <w:rPr>
+          <w:b/>
+        </w:rPr>
+        <w:t xml:space="preserve">Doppia catena di chiavi: </w:t>
+      </w:r>
+      <w:r>
+        <w:t>mantiene due ratchet in parallelo — uno classico (veloce) e uno post-quantistico (periodico) — combinando i segreti in ogni aggiornamento.</w:t>
+      </w:r>
+    </w:p>
+    <w:p>
+      <w:pPr>
+        <w:pStyle w:val="ListBullet"/>
+      </w:pPr>
+      <w:r>
+        <w:rPr>
+          <w:b/>
+        </w:rPr>
+        <w:t xml:space="preserve">Break-in recovery PQC: </w:t>
+      </w:r>
+      <w:r>
+        <w:t>se un attaccante compromette le chiavi correnti, il ratchet post-quantistico garantisce che le sessioni future tornino sicure senza richiedere azioni da parte dell'utente.</w:t>
+      </w:r>
+    </w:p>
+    <w:p>
+      <w:pPr>
+        <w:pStyle w:val="ListBullet"/>
+      </w:pPr>
+      <w:r>
+        <w:rPr>
+          <w:b/>
+        </w:rPr>
+        <w:t xml:space="preserve">Chiamate voice/video: </w:t>
+      </w:r>
+      <w:r>
+        <w:t>PQXDH e SPQR si applicano anche alle chiamate P2P, non solo alla messaggistica testuale.</w:t>
+      </w:r>
+    </w:p>
+    <w:p>
+      <w:pPr>
+        <w:pStyle w:val="Heading3"/>
+      </w:pPr>
+      <w:r>
+        <w:t>Collaborazione IBM — Quantum Safe Messaging Research</w:t>
+      </w:r>
+    </w:p>
+    <w:p>
+      <w:pPr/>
+      <w:r>
+        <w:rPr>
+          <w:b w:val="0"/>
+          <w:i w:val="0"/>
+        </w:rPr>
+        <w:t>Dal 2024 IBM Research collabora con Signal e Threema per l'integrazione di algoritmi post-quantistici nei loro protocolli. L'obiettivo è garantire che le stesse garanzie di privacy offerte oggi — inclusa l'impossibilità per Signal stessa di leggere i messaggi — siano mantenute in un ambiente post-quantistico. I ricercatori IBM hanno contribuito alla progettazione di SPQR e alla verifica formale delle proprietà di sicurezza del nuovo protocollo.</w:t>
+      </w:r>
+    </w:p>
+    <w:p>
+      <w:pPr>
+        <w:pStyle w:val="Heading3"/>
+      </w:pPr>
+      <w:r>
+        <w:t>Caratteristiche Tecniche Signal</w:t>
+      </w:r>
+    </w:p>
+    <w:p>
+      <w:pPr>
+        <w:pStyle w:val="ListBullet"/>
+      </w:pPr>
+      <w:r>
+        <w:rPr>
+          <w:b/>
+        </w:rPr>
+        <w:t xml:space="preserve">Cifratura iniziale sessione: </w:t>
+      </w:r>
+      <w:r>
+        <w:t>PQXDH (X25519 + Kyber-1024) — ibrido classico/PQC</w:t>
+      </w:r>
+    </w:p>
+    <w:p>
+      <w:pPr>
+        <w:pStyle w:val="ListBullet"/>
+      </w:pPr>
+      <w:r>
+        <w:rPr>
+          <w:b/>
+        </w:rPr>
+        <w:t xml:space="preserve">Cifratura continua: </w:t>
+      </w:r>
+      <w:r>
+        <w:t>SPQR — Double Ratchet con componente post-quantistica</w:t>
+      </w:r>
+    </w:p>
+    <w:p>
+      <w:pPr>
+        <w:pStyle w:val="ListBullet"/>
+      </w:pPr>
+      <w:r>
+        <w:rPr>
+          <w:b/>
+        </w:rPr>
+        <w:t xml:space="preserve">Cifratura messaggi: </w:t>
+      </w:r>
+      <w:r>
+        <w:t>AES-256-CBC + HMAC-SHA256</w:t>
+      </w:r>
+    </w:p>
+    <w:p>
+      <w:pPr>
+        <w:pStyle w:val="ListBullet"/>
+      </w:pPr>
+      <w:r>
+        <w:rPr>
+          <w:b/>
+        </w:rPr>
+        <w:t xml:space="preserve">Chiamate voice/video P2P: </w:t>
+      </w:r>
+      <w:r>
+        <w:t>WebRTC cifrato con DTLS-SRTP + chiavi derivate da PQXDH/SPQR</w:t>
+      </w:r>
+    </w:p>
+    <w:p>
+      <w:pPr>
+        <w:pStyle w:val="ListBullet"/>
+      </w:pPr>
+      <w:r>
+        <w:rPr>
+          <w:b/>
+        </w:rPr>
+        <w:t xml:space="preserve">Platform: </w:t>
+      </w:r>
+      <w:r>
+        <w:t>iOS, Android, Windows, macOS, Linux</w:t>
+      </w:r>
+    </w:p>
+    <w:p>
+      <w:pPr>
+        <w:pStyle w:val="ListBullet"/>
+      </w:pPr>
+      <w:r>
+        <w:rPr>
+          <w:b/>
+        </w:rPr>
+        <w:t xml:space="preserve">Open source: </w:t>
+      </w:r>
+      <w:r>
+        <w:t>protocollo e app completamente open source — verificabile da terzi</w:t>
+      </w:r>
+    </w:p>
+    <w:p>
+      <w:pPr>
+        <w:pStyle w:val="ListBullet"/>
+      </w:pPr>
+      <w:r>
+        <w:rPr>
+          <w:b/>
+        </w:rPr>
+        <w:t xml:space="preserve">Metadati: </w:t>
+      </w:r>
+      <w:r>
+        <w:t>Signal minimizza la raccolta di metadati (a differenza di WhatsApp)</w:t>
+      </w:r>
+    </w:p>
+    <w:p>
+      <w:pPr>
+        <w:pStyle w:val="ListBullet"/>
+      </w:pPr>
+      <w:r>
+        <w:rPr>
+          <w:b/>
+        </w:rPr>
+        <w:t xml:space="preserve">Signal for Enterprise: </w:t>
+      </w:r>
+      <w:r>
+        <w:t>disponibile per deployment istituzionale con controlli aggiuntivi</w:t>
+      </w:r>
+    </w:p>
+    <w:p>
+      <w:pPr>
+        <w:pStyle w:val="Heading3"/>
+      </w:pPr>
+      <w:r>
+        <w:t>Limitazioni rispetto a Cellcrypt</w:t>
+      </w:r>
+    </w:p>
+    <w:p>
+      <w:pPr>
+        <w:pStyle w:val="ListBullet"/>
+      </w:pPr>
+      <w:r>
+        <w:rPr>
+          <w:b/>
+        </w:rPr>
+        <w:t xml:space="preserve">No dual-algorithm: </w:t>
+      </w:r>
+      <w:r>
+        <w:t>usa solo Kyber, non aggiunge un secondo algoritmo PQC come McEliece.</w:t>
+      </w:r>
+    </w:p>
+    <w:p>
+      <w:pPr>
+        <w:pStyle w:val="ListBullet"/>
+      </w:pPr>
+      <w:r>
+        <w:rPr>
+          <w:b/>
+        </w:rPr>
+        <w:t xml:space="preserve">SPQR "sparso": </w:t>
+      </w:r>
+      <w:r>
+        <w:t>il ratchet PQC non si aggiorna ad ogni messaggio, lasciando finestre teoriche.</w:t>
+      </w:r>
+    </w:p>
+    <w:p>
+      <w:pPr>
+        <w:pStyle w:val="ListBullet"/>
+      </w:pPr>
+      <w:r>
+        <w:rPr>
+          <w:b/>
+        </w:rPr>
+        <w:t xml:space="preserve">No on-premises: </w:t>
+      </w:r>
+      <w:r>
+        <w:t>Signal è SaaS; non esiste deployment completamente privato per enterprise.</w:t>
+      </w:r>
+    </w:p>
+    <w:p>
+      <w:pPr>
+        <w:pStyle w:val="ListBullet"/>
+      </w:pPr>
+      <w:r>
+        <w:rPr>
+          <w:b/>
+        </w:rPr>
+        <w:t xml:space="preserve">Certificazioni: </w:t>
+      </w:r>
+      <w:r>
+        <w:t>Signal non ha certificazioni militari (FIPS, NATO NIAPC) a differenza di Cellcrypt.</w:t>
+      </w:r>
+    </w:p>
+    <w:p>
+      <w:pPr>
+        <w:pStyle w:val="Heading2"/>
+      </w:pPr>
+      <w:r>
+        <w:t>5. Confronto Diretto: Cellcrypt vs Signal</w:t>
+      </w:r>
+    </w:p>
+    <w:p>
+      <w:pPr/>
+      <w:r>
+        <w:rPr>
+          <w:b w:val="0"/>
+          <w:i w:val="0"/>
+        </w:rPr>
+      </w:r>
+    </w:p>
+    <w:tbl>
+      <w:tblPr>
+        <w:tblStyle w:val="TableGrid"/>
+        <w:tblW w:type="auto" w:w="0"/>
+        <w:tblLook w:firstColumn="1" w:firstRow="1" w:lastColumn="0" w:lastRow="0" w:noHBand="0" w:noVBand="1" w:val="04A0"/>
+      </w:tblPr>
+      <w:tblGrid>
+        <w:gridCol w:w="3135"/>
+        <w:gridCol w:w="3135"/>
+        <w:gridCol w:w="3135"/>
+      </w:tblGrid>
+      <w:tr>
+        <w:tc>
+          <w:tcPr>
+            <w:tcW w:type="dxa" w:w="3135"/>
+          </w:tcPr>
+          <w:p>
+            <w:r>
+              <w:rPr>
+                <w:b/>
+                <w:sz w:val="18"/>
+              </w:rPr>
+              <w:t>Criterio</w:t>
+            </w:r>
+          </w:p>
+        </w:tc>
+        <w:tc>
+          <w:tcPr>
+            <w:tcW w:type="dxa" w:w="3135"/>
+          </w:tcPr>
+          <w:p>
+            <w:r>
+              <w:rPr>
+                <w:b/>
+                <w:sz w:val="18"/>
+              </w:rPr>
+              <w:t>Cellcrypt</w:t>
+            </w:r>
+          </w:p>
+        </w:tc>
+        <w:tc>
+          <w:tcPr>
+            <w:tcW w:type="dxa" w:w="3135"/>
+          </w:tcPr>
+          <w:p>
+            <w:r>
+              <w:rPr>
+                <w:b/>
+                <w:sz w:val="18"/>
+              </w:rPr>
+              <w:t>Signal (PQXDH + SPQR)</w:t>
+            </w:r>
+          </w:p>
+        </w:tc>
+      </w:tr>
+      <w:tr>
+        <w:tc>
+          <w:tcPr>
+            <w:tcW w:type="dxa" w:w="3135"/>
+          </w:tcPr>
+          <w:p>
+            <w:r>
+              <w:rPr>
+                <w:sz w:val="17"/>
+              </w:rPr>
+              <w:t>Algoritmi PQC</w:t>
+            </w:r>
+          </w:p>
+        </w:tc>
+        <w:tc>
+          <w:tcPr>
+            <w:tcW w:type="dxa" w:w="3135"/>
+          </w:tcPr>
+          <w:p>
+            <w:r>
+              <w:rPr>
+                <w:sz w:val="17"/>
+              </w:rPr>
+              <w:t>Kyber + McEliece (dual)</w:t>
+            </w:r>
+          </w:p>
+        </w:tc>
+        <w:tc>
+          <w:tcPr>
+            <w:tcW w:type="dxa" w:w="3135"/>
+          </w:tcPr>
+          <w:p>
+            <w:r>
+              <w:rPr>
+                <w:sz w:val="17"/>
+              </w:rPr>
+              <w:t>Kyber-1024 (single)</w:t>
+            </w:r>
+          </w:p>
+        </w:tc>
+      </w:tr>
+      <w:tr>
+        <w:tc>
+          <w:tcPr>
+            <w:tcW w:type="dxa" w:w="3135"/>
+          </w:tcPr>
+          <w:p>
+            <w:r>
+              <w:rPr>
+                <w:sz w:val="17"/>
+              </w:rPr>
+              <w:t>Approccio</w:t>
+            </w:r>
+          </w:p>
+        </w:tc>
+        <w:tc>
+          <w:tcPr>
+            <w:tcW w:type="dxa" w:w="3135"/>
+          </w:tcPr>
+          <w:p>
+            <w:r>
+              <w:rPr>
+                <w:sz w:val="17"/>
+              </w:rPr>
+              <w:t>Dual-layer indipendente</w:t>
+            </w:r>
+          </w:p>
+        </w:tc>
+        <w:tc>
+          <w:tcPr>
+            <w:tcW w:type="dxa" w:w="3135"/>
+          </w:tcPr>
+          <w:p>
+            <w:r>
+              <w:rPr>
+                <w:sz w:val="17"/>
+              </w:rPr>
+              <w:t>Hybrid classico/PQC</w:t>
+            </w:r>
+          </w:p>
+        </w:tc>
+      </w:tr>
+      <w:tr>
+        <w:tc>
+          <w:tcPr>
+            <w:tcW w:type="dxa" w:w="3135"/>
+          </w:tcPr>
+          <w:p>
+            <w:r>
+              <w:rPr>
+                <w:sz w:val="17"/>
+              </w:rPr>
+              <w:t>PFS post-quantistica</w:t>
+            </w:r>
+          </w:p>
+        </w:tc>
+        <w:tc>
+          <w:tcPr>
+            <w:tcW w:type="dxa" w:w="3135"/>
+          </w:tcPr>
+          <w:p>
+            <w:r>
+              <w:rPr>
+                <w:sz w:val="17"/>
+              </w:rPr>
+              <w:t>Sì (ogni sessione)</w:t>
+            </w:r>
+          </w:p>
+        </w:tc>
+        <w:tc>
+          <w:tcPr>
+            <w:tcW w:type="dxa" w:w="3135"/>
+          </w:tcPr>
+          <w:p>
+            <w:r>
+              <w:rPr>
+                <w:sz w:val="17"/>
+              </w:rPr>
+              <w:t>Sì (SPQR, periodica)</w:t>
+            </w:r>
+          </w:p>
+        </w:tc>
+      </w:tr>
+      <w:tr>
+        <w:tc>
+          <w:tcPr>
+            <w:tcW w:type="dxa" w:w="3135"/>
+          </w:tcPr>
+          <w:p>
+            <w:r>
+              <w:rPr>
+                <w:sz w:val="17"/>
+              </w:rPr>
+              <w:t>Chiamate P2P</w:t>
+            </w:r>
+          </w:p>
+        </w:tc>
+        <w:tc>
+          <w:tcPr>
+            <w:tcW w:type="dxa" w:w="3135"/>
+          </w:tcPr>
+          <w:p>
+            <w:r>
+              <w:rPr>
+                <w:sz w:val="17"/>
+              </w:rPr>
+              <w:t>Sì (voice, video, file)</w:t>
+            </w:r>
+          </w:p>
+        </w:tc>
+        <w:tc>
+          <w:tcPr>
+            <w:tcW w:type="dxa" w:w="3135"/>
+          </w:tcPr>
+          <w:p>
+            <w:r>
+              <w:rPr>
+                <w:sz w:val="17"/>
+              </w:rPr>
+              <w:t>Sì (voice, video)</w:t>
+            </w:r>
+          </w:p>
+        </w:tc>
+      </w:tr>
+      <w:tr>
+        <w:tc>
+          <w:tcPr>
+            <w:tcW w:type="dxa" w:w="3135"/>
+          </w:tcPr>
+          <w:p>
+            <w:r>
+              <w:rPr>
+                <w:sz w:val="17"/>
+              </w:rPr>
+              <w:t>Deployment</w:t>
+            </w:r>
+          </w:p>
+        </w:tc>
+        <w:tc>
+          <w:tcPr>
+            <w:tcW w:type="dxa" w:w="3135"/>
+          </w:tcPr>
+          <w:p>
+            <w:r>
+              <w:rPr>
+                <w:sz w:val="17"/>
+              </w:rPr>
+              <w:t>SaaS / On-prem / Hybrid</w:t>
+            </w:r>
+          </w:p>
+        </w:tc>
+        <w:tc>
+          <w:tcPr>
+            <w:tcW w:type="dxa" w:w="3135"/>
+          </w:tcPr>
+          <w:p>
+            <w:r>
+              <w:rPr>
+                <w:sz w:val="17"/>
+              </w:rPr>
+              <w:t>SaaS only</w:t>
+            </w:r>
+          </w:p>
+        </w:tc>
+      </w:tr>
+      <w:tr>
+        <w:tc>
+          <w:tcPr>
+            <w:tcW w:type="dxa" w:w="3135"/>
+          </w:tcPr>
+          <w:p>
+            <w:r>
+              <w:rPr>
+                <w:sz w:val="17"/>
+              </w:rPr>
+              <w:t>Open source</w:t>
+            </w:r>
+          </w:p>
+        </w:tc>
+        <w:tc>
+          <w:tcPr>
+            <w:tcW w:type="dxa" w:w="3135"/>
+          </w:tcPr>
+          <w:p>
+            <w:r>
+              <w:rPr>
+                <w:sz w:val="17"/>
+              </w:rPr>
+              <w:t>No</w:t>
+            </w:r>
+          </w:p>
+        </w:tc>
+        <w:tc>
+          <w:tcPr>
+            <w:tcW w:type="dxa" w:w="3135"/>
+          </w:tcPr>
+          <w:p>
+            <w:r>
+              <w:rPr>
+                <w:sz w:val="17"/>
+              </w:rPr>
+              <w:t>Sì (protocollo e app)</w:t>
+            </w:r>
+          </w:p>
+        </w:tc>
+      </w:tr>
+      <w:tr>
+        <w:tc>
+          <w:tcPr>
+            <w:tcW w:type="dxa" w:w="3135"/>
+          </w:tcPr>
+          <w:p>
+            <w:r>
+              <w:rPr>
+                <w:sz w:val="17"/>
+              </w:rPr>
+              <w:t>Certificazioni</w:t>
+            </w:r>
+          </w:p>
+        </w:tc>
+        <w:tc>
+          <w:tcPr>
+            <w:tcW w:type="dxa" w:w="3135"/>
+          </w:tcPr>
+          <w:p>
+            <w:r>
+              <w:rPr>
+                <w:sz w:val="17"/>
+              </w:rPr>
+              <w:t>FIPS 140-2, NATO NIAPC</w:t>
+            </w:r>
+          </w:p>
+        </w:tc>
+        <w:tc>
+          <w:tcPr>
+            <w:tcW w:type="dxa" w:w="3135"/>
+          </w:tcPr>
+          <w:p>
+            <w:r>
+              <w:rPr>
+                <w:sz w:val="17"/>
+              </w:rPr>
+              <w:t>Nessuna militare</w:t>
+            </w:r>
+          </w:p>
+        </w:tc>
+      </w:tr>
+      <w:tr>
+        <w:tc>
+          <w:tcPr>
+            <w:tcW w:type="dxa" w:w="3135"/>
+          </w:tcPr>
+          <w:p>
+            <w:r>
+              <w:rPr>
+                <w:sz w:val="17"/>
+              </w:rPr>
+              <w:t>Target principale</w:t>
+            </w:r>
+          </w:p>
+        </w:tc>
+        <w:tc>
+          <w:tcPr>
+            <w:tcW w:type="dxa" w:w="3135"/>
+          </w:tcPr>
+          <w:p>
+            <w:r>
+              <w:rPr>
+                <w:sz w:val="17"/>
+              </w:rPr>
+              <w:t>Difesa, governi, enterprise</w:t>
+            </w:r>
+          </w:p>
+        </w:tc>
+        <w:tc>
+          <w:tcPr>
+            <w:tcW w:type="dxa" w:w="3135"/>
+          </w:tcPr>
+          <w:p>
+            <w:r>
+              <w:rPr>
+                <w:sz w:val="17"/>
+              </w:rPr>
+              <w:t>Consumer + enterprise</w:t>
+            </w:r>
+          </w:p>
+        </w:tc>
+      </w:tr>
+      <w:tr>
+        <w:tc>
+          <w:tcPr>
+            <w:tcW w:type="dxa" w:w="3135"/>
+          </w:tcPr>
+          <w:p>
+            <w:r>
+              <w:rPr>
+                <w:sz w:val="17"/>
+              </w:rPr>
+              <w:t>Costo</w:t>
+            </w:r>
+          </w:p>
+        </w:tc>
+        <w:tc>
+          <w:tcPr>
+            <w:tcW w:type="dxa" w:w="3135"/>
+          </w:tcPr>
+          <w:p>
+            <w:r>
+              <w:rPr>
+                <w:sz w:val="17"/>
+              </w:rPr>
+              <w:t>Enterprise (licenze dedicate)</w:t>
+            </w:r>
+          </w:p>
+        </w:tc>
+        <w:tc>
+          <w:tcPr>
+            <w:tcW w:type="dxa" w:w="3135"/>
+          </w:tcPr>
+          <w:p>
+            <w:r>
+              <w:rPr>
+                <w:sz w:val="17"/>
+              </w:rPr>
+              <w:t>Gratuito / Signal for Ent.</w:t>
+            </w:r>
+          </w:p>
+        </w:tc>
+      </w:tr>
+      <w:tr>
+        <w:tc>
+          <w:tcPr>
+            <w:tcW w:type="dxa" w:w="3135"/>
+          </w:tcPr>
+          <w:p>
+            <w:r>
+              <w:rPr>
+                <w:sz w:val="17"/>
+              </w:rPr>
+              <w:t>Maturità PQC</w:t>
+            </w:r>
+          </w:p>
+        </w:tc>
+        <w:tc>
+          <w:tcPr>
+            <w:tcW w:type="dxa" w:w="3135"/>
+          </w:tcPr>
+          <w:p>
+            <w:r>
+              <w:rPr>
+                <w:sz w:val="17"/>
+              </w:rPr>
+              <w:t>In produzione da anni</w:t>
+            </w:r>
+          </w:p>
+        </w:tc>
+        <w:tc>
+          <w:tcPr>
+            <w:tcW w:type="dxa" w:w="3135"/>
+          </w:tcPr>
+          <w:p>
+            <w:r>
+              <w:rPr>
+                <w:sz w:val="17"/>
+              </w:rPr>
+              <w:t>In produzione dal 2023-2025</w:t>
+            </w:r>
+          </w:p>
+        </w:tc>
+      </w:tr>
+      <w:tr>
+        <w:tc>
+          <w:tcPr>
+            <w:tcW w:type="dxa" w:w="3135"/>
+          </w:tcPr>
+          <w:p>
+            <w:r>
+              <w:rPr>
+                <w:sz w:val="17"/>
+              </w:rPr>
+              <w:t>Harvest now decrypt later</w:t>
+            </w:r>
+          </w:p>
+        </w:tc>
+        <w:tc>
+          <w:tcPr>
+            <w:tcW w:type="dxa" w:w="3135"/>
+          </w:tcPr>
+          <w:p>
+            <w:r>
+              <w:rPr>
+                <w:sz w:val="17"/>
+              </w:rPr>
+              <w:t>Protetto (dual PQC)</w:t>
+            </w:r>
+          </w:p>
+        </w:tc>
+        <w:tc>
+          <w:tcPr>
+            <w:tcW w:type="dxa" w:w="3135"/>
+          </w:tcPr>
+          <w:p>
+            <w:r>
+              <w:rPr>
+                <w:sz w:val="17"/>
+              </w:rPr>
+              <w:t>Protetto (PQXDH)</w:t>
+            </w:r>
+          </w:p>
+        </w:tc>
+      </w:tr>
+    </w:tbl>
+    <w:p/>
+    <w:p>
+      <w:pPr>
+        <w:pStyle w:val="Heading2"/>
+      </w:pPr>
+      <w:r>
+        <w:t>6. Standard e Regolamentazione di Riferimento</w:t>
+      </w:r>
+    </w:p>
+    <w:p>
+      <w:pPr>
+        <w:pStyle w:val="ListBullet"/>
+      </w:pPr>
+      <w:r>
+        <w:rPr>
+          <w:b/>
+        </w:rPr>
+        <w:t xml:space="preserve">NIST FIPS 203 (ML-KEM/Kyber): </w:t>
+      </w:r>
+      <w:r>
+        <w:t>Standard ufficiale USA per Key Encapsulation Mechanism post-quantistico. Pubblicato agosto 2024.</w:t>
+      </w:r>
+    </w:p>
+    <w:p>
+      <w:pPr>
+        <w:pStyle w:val="ListBullet"/>
+      </w:pPr>
+      <w:r>
+        <w:rPr>
+          <w:b/>
+        </w:rPr>
+        <w:t xml:space="preserve">NIST FIPS 204 (ML-DSA/Dilithium): </w:t>
+      </w:r>
+      <w:r>
+        <w:t>Standard per firme digitali post-quantistiche.</w:t>
+      </w:r>
+    </w:p>
+    <w:p>
+      <w:pPr>
+        <w:pStyle w:val="ListBullet"/>
+      </w:pPr>
+      <w:r>
+        <w:rPr>
+          <w:b/>
+        </w:rPr>
+        <w:t xml:space="preserve">NIST FIPS 205 (SLH-DSA): </w:t>
+      </w:r>
+      <w:r>
+        <w:t>Standard alternativo per firme digitali (basato su hash).</w:t>
+      </w:r>
+    </w:p>
+    <w:p>
+      <w:pPr>
+        <w:pStyle w:val="ListBullet"/>
+      </w:pPr>
+      <w:r>
+        <w:rPr>
+          <w:b/>
+        </w:rPr>
+        <w:t xml:space="preserve">NIS2 Directive (UE): </w:t>
+      </w:r>
+      <w:r>
+        <w:t>Richiede misure di sicurezza "state of the art" — la PQC sarà progressivamente obbligatoria per operatori di servizi essenziali.</w:t>
+      </w:r>
+    </w:p>
+    <w:p>
+      <w:pPr>
+        <w:pStyle w:val="ListBullet"/>
+      </w:pPr>
+      <w:r>
+        <w:rPr>
+          <w:b/>
+        </w:rPr>
+        <w:t xml:space="preserve">DORA (Digital Operational Resilience Act): </w:t>
+      </w:r>
+      <w:r>
+        <w:t>Per il settore finanziario UE: la crittografia post-quantistica diventa requisito di resilienza operativa.</w:t>
+      </w:r>
+    </w:p>
+    <w:p>
+      <w:pPr>
+        <w:pStyle w:val="ListBullet"/>
+      </w:pPr>
+      <w:r>
+        <w:rPr>
+          <w:b/>
+        </w:rPr>
+        <w:t xml:space="preserve">BSI (Germania): </w:t>
+      </w:r>
+      <w:r>
+        <w:t>L'Ufficio federale tedesco per la sicurezza informatica raccomanda già la migrazione a PQC per comunicazioni classificate.</w:t>
+      </w:r>
+    </w:p>
+    <w:p>
+      <w:pPr>
+        <w:pStyle w:val="Heading2"/>
+      </w:pPr>
+      <w:r>
+        <w:t>7. Conclusioni e Raccomandazioni</w:t>
+      </w:r>
+    </w:p>
+    <w:p>
+      <w:pPr/>
+      <w:r>
+        <w:rPr>
+          <w:b w:val="0"/>
+          <w:i w:val="0"/>
+        </w:rPr>
+        <w:t>Il mercato della comunicazione P2P post-quantistica è in rapida evoluzione. Le organizzazioni che trattano informazioni sensibili con orizzonte temporale superiore a 5-10 anni devono avviare oggi la transizione verso soluzioni PQC-ready.</w:t>
+      </w:r>
+    </w:p>
+    <w:p>
+      <w:pPr/>
+      <w:r>
+        <w:rPr>
+          <w:b/>
+          <w:i w:val="0"/>
+        </w:rPr>
+        <w:t>Raccomandazioni per profilo:</w:t>
+      </w:r>
+    </w:p>
+    <w:p>
+      <w:pPr>
+        <w:pStyle w:val="ListBullet"/>
+      </w:pPr>
+      <w:r>
+        <w:rPr>
+          <w:b/>
+        </w:rPr>
+        <w:t xml:space="preserve">Difesa / Governo / Intelligence: </w:t>
+      </w:r>
+      <w:r>
+        <w:t>Cellcrypt — unica soluzione con dual-layer PQC certificata per uso militare.</w:t>
+      </w:r>
+    </w:p>
+    <w:p>
+      <w:pPr>
+        <w:pStyle w:val="ListBullet"/>
+      </w:pPr>
+      <w:r>
+        <w:rPr>
+          <w:b/>
+        </w:rPr>
+        <w:t xml:space="preserve">Enterprise regolamentata (DORA, NIS2): </w:t>
+      </w:r>
+      <w:r>
+        <w:t>Cellcrypt (massima sicurezza) o AWS Wickr (integrazione enterprise).</w:t>
+      </w:r>
+    </w:p>
+    <w:p>
+      <w:pPr>
+        <w:pStyle w:val="ListBullet"/>
+      </w:pPr>
+      <w:r>
+        <w:rPr>
+          <w:b/>
+        </w:rPr>
+        <w:t xml:space="preserve">PMI / Professionisti: </w:t>
+      </w:r>
+      <w:r>
+        <w:t>Signal con PQXDH abilitato — gratuito, open source, protezione PQC reale già oggi.</w:t>
+      </w:r>
+    </w:p>
+    <w:p>
+      <w:pPr>
+        <w:pStyle w:val="ListBullet"/>
+      </w:pPr>
+      <w:r>
+        <w:rPr>
+          <w:b/>
+        </w:rPr>
+        <w:t xml:space="preserve">Organizzazioni no-profit / giornalismo: </w:t>
+      </w:r>
+      <w:r>
+        <w:t>Signal — massima accessibilità con protezione PQC avanzata.</w:t>
+      </w:r>
+    </w:p>
+    <w:p>
+      <w:pPr>
+        <w:pStyle w:val="ListBullet"/>
+      </w:pPr>
+      <w:r>
+        <w:rPr>
+          <w:b/>
+        </w:rPr>
+        <w:t xml:space="preserve">Multinazionali con Teams/M365: </w:t>
+      </w:r>
+      <w:r>
+        <w:t>Monitorare roadmap Microsoft PQC 2025-2026 per transizione nativa.</w:t>
+      </w:r>
+    </w:p>
+    <w:p>
+      <w:pPr/>
+      <w:r>
+        <w:rPr>
+          <w:b w:val="0"/>
+          <w:i w:val="0"/>
+        </w:rPr>
+      </w:r>
+    </w:p>
+    <w:p>
+      <w:pPr/>
+      <w:r>
+        <w:rPr>
+          <w:b w:val="0"/>
+          <w:i/>
+        </w:rPr>
+        <w:t>La protezione post-quantistica non è più un tema di ricerca accademica: è una realtà operativa per le soluzioni di punta del mercato. La finestra di opportunità per prepararsi è ora, prima che il paradigma "harvest now, decrypt later" diventi una minaccia concreta e immediata.</w:t>
+      </w:r>
+    </w:p>
     <w:sectPr>
       <w:headerReference w:type="default" r:id="rId9"/>
       <w:footerReference w:type="default" r:id="rId10"/>

</xml_diff>